<commit_message>
Add student name to Annotated Bibliography 1
Co-Authored-By: Claude Opus 5.5 <noreply@anthropic.com>
Claude-Session: https://claude.ai/code/session_011GYb193kPHTSugqnRrp24G
</commit_message>
<xml_diff>
--- a/annotated-bib/Annotated_Bibliography_1.docx
+++ b/annotated-bib/Annotated_Bibliography_1.docx
@@ -4,7 +4,7 @@
   <w:body>
     <w:p>
       <w:r>
-        <w:t>Firstname Lastname</w:t>
+        <w:t>Ryan Bullock</w:t>
       </w:r>
     </w:p>
     <w:p>
@@ -83,7 +83,7 @@
       <w:jc w:val="right"/>
     </w:pPr>
     <w:r>
-      <w:t xml:space="preserve">Lastname </w:t>
+      <w:t xml:space="preserve">Bullock </w:t>
     </w:r>
     <w:r>
       <w:fldChar w:fldCharType="begin"/>

</xml_diff>

<commit_message>
Add instructor and course to Annotated Bibliography 1
Co-Authored-By: Claude Opus 5.5 <noreply@anthropic.com>
Claude-Session: https://claude.ai/code/session_011GYb193kPHTSugqnRrp24G
</commit_message>
<xml_diff>
--- a/annotated-bib/Annotated_Bibliography_1.docx
+++ b/annotated-bib/Annotated_Bibliography_1.docx
@@ -9,12 +9,12 @@
     </w:p>
     <w:p>
       <w:r>
-        <w:t>Professor Name</w:t>
+        <w:t>Mrs. Peerbroom</w:t>
       </w:r>
     </w:p>
     <w:p>
       <w:r>
-        <w:t>English 102</w:t>
+        <w:t>ENG 1113</w:t>
       </w:r>
     </w:p>
     <w:p>

</xml_diff>

<commit_message>
Change dates in Annotated Bibliography 1 to 25 October 2026
Co-Authored-By: Claude Opus 5.5 <noreply@anthropic.com>
Claude-Session: https://claude.ai/code/session_011GYb193kPHTSugqnRrp24G
</commit_message>
<xml_diff>
--- a/annotated-bib/Annotated_Bibliography_1.docx
+++ b/annotated-bib/Annotated_Bibliography_1.docx
@@ -19,7 +19,7 @@
     </w:p>
     <w:p>
       <w:r>
-        <w:t>29 October 2026</w:t>
+        <w:t>25 October 2026</w:t>
       </w:r>
     </w:p>
     <w:p>
@@ -53,7 +53,7 @@
         <w:t>Academic Search Complete</w:t>
       </w:r>
       <w:r>
-        <w:t>, https://doi.org/10.1080/02673843.2019.1590851. Accessed 29 Oct. 2026.</w:t>
+        <w:t>, https://doi.org/10.1080/02673843.2019.1590851. Accessed 25 Oct. 2026.</w:t>
       </w:r>
     </w:p>
     <w:p>

</xml_diff>